<commit_message>
Actualización de archivos del Desafío
</commit_message>
<xml_diff>
--- a/Farina_Desafío-SistemaGestionVentas.docx
+++ b/Farina_Desafío-SistemaGestionVentas.docx
@@ -319,7 +319,10 @@
       </w:r>
       <w:proofErr w:type="spellStart"/>
       <w:r>
-        <w:t>ﬁnales</w:t>
+        <w:t>ﬁ</w:t>
+      </w:r>
+      <w:r>
+        <w:t>nales</w:t>
       </w:r>
       <w:proofErr w:type="spellEnd"/>
       <w:r>
@@ -1166,7 +1169,10 @@
       </w:r>
       <w:proofErr w:type="spellStart"/>
       <w:r>
-        <w:t>ﬁnal</w:t>
+        <w:t>ﬁ</w:t>
+      </w:r>
+      <w:r>
+        <w:t>nal</w:t>
       </w:r>
       <w:proofErr w:type="spellEnd"/>
       <w:r>
@@ -1666,7 +1672,13 @@
         <w:rPr>
           <w:spacing w:val="-4"/>
         </w:rPr>
-        <w:t>ﬁnal</w:t>
+        <w:t>ﬁ</w:t>
+      </w:r>
+      <w:r>
+        <w:rPr>
+          <w:spacing w:val="-4"/>
+        </w:rPr>
+        <w:t>nal</w:t>
       </w:r>
       <w:proofErr w:type="spellEnd"/>
     </w:p>
@@ -2138,11 +2150,9 @@
         </w:tabs>
         <w:ind w:left="2182" w:hanging="359"/>
       </w:pPr>
-      <w:proofErr w:type="gramStart"/>
       <w:r>
         <w:t>Total</w:t>
       </w:r>
-      <w:proofErr w:type="gramEnd"/>
       <w:r>
         <w:rPr>
           <w:spacing w:val="-14"/>
@@ -2795,13 +2805,7 @@
         <w:t xml:space="preserve"> se incluye una captura con dos ejemplos de compras realizadas por dos clientes de diferentes direcciones, uno a más de 1 km y el otro a </w:t>
       </w:r>
       <w:r>
-        <w:t>menor</w:t>
-      </w:r>
-      <w:r>
-        <w:t xml:space="preserve"> distancia</w:t>
-      </w:r>
-      <w:r>
-        <w:t xml:space="preserve"> y el output de la terminal. </w:t>
+        <w:t xml:space="preserve">menor distancia y el output de la terminal. </w:t>
       </w:r>
     </w:p>
     <w:p>
@@ -2821,6 +2825,9 @@
         <w:ind w:firstLine="0"/>
       </w:pPr>
       <w:r>
+        <w:rPr>
+          <w:noProof/>
+        </w:rPr>
         <w:drawing>
           <wp:inline distT="0" distB="0" distL="0" distR="0" wp14:anchorId="445BF6A3" wp14:editId="6E9B7A04">
             <wp:extent cx="5769610" cy="2021205"/>
@@ -2865,6 +2872,9 @@
         <w:ind w:firstLine="0"/>
       </w:pPr>
       <w:r>
+        <w:rPr>
+          <w:noProof/>
+        </w:rPr>
         <w:lastRenderedPageBreak/>
         <w:drawing>
           <wp:inline distT="0" distB="0" distL="0" distR="0" wp14:anchorId="730239AD" wp14:editId="56098462">
@@ -2939,14 +2949,34 @@
       <w:r>
         <w:t xml:space="preserve">En el siguiente enlace de GitHub se encuentra el </w:t>
       </w:r>
-      <w:proofErr w:type="gramStart"/>
-      <w:r>
-        <w:t>script</w:t>
-      </w:r>
-      <w:proofErr w:type="gramEnd"/>
+      <w:r>
+        <w:t>script,</w:t>
+      </w:r>
       <w:r>
         <w:t xml:space="preserve"> así como el material asociado a este desafío: </w:t>
       </w:r>
+    </w:p>
+    <w:p>
+      <w:pPr>
+        <w:pStyle w:val="BodyText"/>
+        <w:spacing w:before="48"/>
+        <w:ind w:firstLine="0"/>
+      </w:pPr>
+      <w:hyperlink r:id="rId12" w:history="1">
+        <w:r>
+          <w:rPr>
+            <w:rStyle w:val="Hyperlink"/>
+          </w:rPr>
+          <w:t>https://github.com/ValeriaPFR/Desafio3_SistemaGestionVentas_RTD-25-01-13-0058-4.git</w:t>
+        </w:r>
+      </w:hyperlink>
+    </w:p>
+    <w:p>
+      <w:pPr>
+        <w:pStyle w:val="BodyText"/>
+        <w:spacing w:before="48"/>
+        <w:ind w:firstLine="0"/>
+      </w:pPr>
     </w:p>
     <w:p>
       <w:pPr>
@@ -2989,7 +3019,7 @@
                     <pic:cNvPicPr/>
                   </pic:nvPicPr>
                   <pic:blipFill>
-                    <a:blip r:embed="rId12" cstate="print"/>
+                    <a:blip r:embed="rId13" cstate="print"/>
                     <a:stretch>
                       <a:fillRect/>
                     </a:stretch>
@@ -4696,6 +4726,7 @@
   <w:style w:type="character" w:default="1" w:styleId="DefaultParagraphFont">
     <w:name w:val="Default Paragraph Font"/>
     <w:uiPriority w:val="1"/>
+    <w:semiHidden/>
     <w:unhideWhenUsed/>
   </w:style>
   <w:style w:type="table" w:default="1" w:styleId="TableNormal">
@@ -4774,6 +4805,29 @@
     <w:rPr>
       <w:rFonts w:ascii="Roboto" w:eastAsia="Roboto" w:hAnsi="Roboto" w:cs="Roboto"/>
       <w:lang w:val="es-ES"/>
+    </w:rPr>
+  </w:style>
+  <w:style w:type="character" w:styleId="Hyperlink">
+    <w:name w:val="Hyperlink"/>
+    <w:basedOn w:val="DefaultParagraphFont"/>
+    <w:uiPriority w:val="99"/>
+    <w:unhideWhenUsed/>
+    <w:rsid w:val="00361726"/>
+    <w:rPr>
+      <w:color w:val="0000FF" w:themeColor="hyperlink"/>
+      <w:u w:val="single"/>
+    </w:rPr>
+  </w:style>
+  <w:style w:type="character" w:styleId="UnresolvedMention">
+    <w:name w:val="Unresolved Mention"/>
+    <w:basedOn w:val="DefaultParagraphFont"/>
+    <w:uiPriority w:val="99"/>
+    <w:semiHidden/>
+    <w:unhideWhenUsed/>
+    <w:rsid w:val="00361726"/>
+    <w:rPr>
+      <w:color w:val="605E5C"/>
+      <w:shd w:val="clear" w:color="auto" w:fill="E1DFDD"/>
     </w:rPr>
   </w:style>
 </w:styles>

</xml_diff>